<commit_message>
docs: separate front matter and restart page numbering at 1 on Chapter 1
</commit_message>
<xml_diff>
--- a/ML-Project Documentation.docx
+++ b/ML-Project Documentation.docx
@@ -7089,12 +7089,14 @@
       <w:pPr>
         <w:spacing w:after="60"/>
         <w:jc w:val="both"/>
+        <w:sectPr>
+          <w:footerReference w:type="default" r:id="rId30"/>
+        </w:sectPr>
       </w:pPr>
     </w:p>
     <w:p>
       <w:pPr>
         <w:pStyle w:val="Heading1"/>
-        <w:pageBreakBefore/>
         <w:spacing w:before="120" w:after="240" w:line="360" w:lineRule="auto"/>
         <w:jc w:val="both"/>
       </w:pPr>
@@ -34150,6 +34152,7 @@
       <w:cols w:space="720"/>
       <w:titlePg/>
       <w:docGrid w:linePitch="360"/>
+      <w:pgNumType w:start="1"/>
     </w:sectPr>
   </w:body>
 </w:document>
@@ -34205,13 +34208,49 @@
       <w:t>Micro Project Report  |  Department of CSE (AI &amp; ML)</w:t>
     </w:r>
     <w:r>
+      <w:tab/>
+    </w:r>
+    <w:r>
       <w:rPr>
         <w:rFonts w:ascii="Times New Roman" w:hAnsi="Times New Roman"/>
         <w:color w:val="595959"/>
         <w:sz w:val="18"/>
         <w:szCs w:val="18"/>
       </w:rPr>
-      <w:tab/>
+      <w:t xml:space="preserve">Page </w:t>
+    </w:r>
+    <w:r>
+      <w:rPr>
+        <w:rFonts w:ascii="Times New Roman" w:hAnsi="Times New Roman"/>
+        <w:sz w:val="18"/>
+      </w:rPr>
+      <w:fldChar w:fldCharType="begin"/>
+    </w:r>
+    <w:r>
+      <w:rPr>
+        <w:rFonts w:ascii="Times New Roman" w:hAnsi="Times New Roman"/>
+        <w:sz w:val="18"/>
+      </w:rPr>
+      <w:instrText xml:space="preserve"> PAGE </w:instrText>
+    </w:r>
+    <w:r>
+      <w:rPr>
+        <w:sz w:val="18"/>
+      </w:rPr>
+      <w:fldChar w:fldCharType="separate"/>
+    </w:r>
+    <w:r>
+      <w:rPr>
+        <w:rFonts w:ascii="Times New Roman" w:hAnsi="Times New Roman"/>
+        <w:sz w:val="18"/>
+      </w:rPr>
+      <w:t>1</w:t>
+    </w:r>
+    <w:r>
+      <w:rPr>
+        <w:sz w:val="18"/>
+      </w:rPr>
+      <w:fldChar w:fldCharType="end"/>
     </w:r>
   </w:p>
 </w:ftr>
@@ -34223,6 +34262,17 @@
     <w:pPr>
       <w:pStyle w:val="Footer"/>
     </w:pPr>
+  </w:p>
+</w:ftr>
+</file>
+
+<file path=word/footer4.xml><?xml version="1.0" encoding="utf-8"?>
+<w:ftr xmlns:m="http://schemas.openxmlformats.org/officeDocument/2006/math" xmlns:mc="http://schemas.openxmlformats.org/markup-compatibility/2006" xmlns:mo="http://schemas.microsoft.com/office/mac/office/2008/main" xmlns:mv="urn:schemas-microsoft-com:mac:vml" xmlns:o="urn:schemas-microsoft-com:office:office" xmlns:r="http://schemas.openxmlformats.org/officeDocument/2006/relationships" xmlns:v="urn:schemas-microsoft-com:vml" xmlns:w10="urn:schemas-microsoft-com:office:word" xmlns:w14="http://schemas.microsoft.com/office/word/2010/wordml" xmlns:w="http://schemas.openxmlformats.org/wordprocessingml/2006/main" xmlns:wne="http://schemas.microsoft.com/office/word/2006/wordml" xmlns:wp14="http://schemas.microsoft.com/office/word/2010/wordprocessingDrawing" xmlns:wp="http://schemas.openxmlformats.org/drawingml/2006/wordprocessingDrawing" xmlns:wpc="http://schemas.microsoft.com/office/word/2010/wordprocessingCanvas" xmlns:wpg="http://schemas.microsoft.com/office/word/2010/wordprocessingGroup" xmlns:wpi="http://schemas.microsoft.com/office/word/2010/wordprocessingInk" xmlns:wps="http://schemas.microsoft.com/office/word/2010/wordprocessingShape" mc:Ignorable="w14 wp14">
+  <w:p>
+    <w:pPr>
+      <w:pStyle w:val="Footer"/>
+    </w:pPr>
+    <w:r/>
   </w:p>
 </w:ftr>
 </file>

</xml_diff>

<commit_message>
docs: add comprehensive dataset specification, academic reports, project documentation, and verification scripts
</commit_message>
<xml_diff>
--- a/ML-Project Documentation.docx
+++ b/ML-Project Documentation.docx
@@ -3145,6 +3145,7 @@
             <w:shd w:val="clear" w:color="auto" w:fill="E8E8E8"/>
             <w:vAlign w:val="center"/>
             <w:shd w:fill="E8E8E8"/>
+            <w:shd w:fill="E8E8E8"/>
           </w:tcPr>
           <w:p>
             <w:pPr>
@@ -3170,6 +3171,7 @@
             <w:shd w:val="clear" w:color="auto" w:fill="E8E8E8"/>
             <w:vAlign w:val="center"/>
             <w:shd w:fill="E8E8E8"/>
+            <w:shd w:fill="E8E8E8"/>
           </w:tcPr>
           <w:p>
             <w:pPr>
@@ -3195,6 +3197,7 @@
             <w:shd w:val="clear" w:color="auto" w:fill="E8E8E8"/>
             <w:vAlign w:val="center"/>
             <w:shd w:fill="E8E8E8"/>
+            <w:shd w:fill="E8E8E8"/>
           </w:tcPr>
           <w:p>
             <w:pPr>
@@ -3219,6 +3222,7 @@
             <w:tcW w:w="2100" w:type="dxa"/>
             <w:shd w:val="clear" w:color="auto" w:fill="E8E8E8"/>
             <w:vAlign w:val="center"/>
+            <w:shd w:fill="E8E8E8"/>
             <w:shd w:fill="E8E8E8"/>
           </w:tcPr>
           <w:p>
@@ -3910,6 +3914,7 @@
             <w:shd w:val="clear" w:color="auto" w:fill="E8E8E8"/>
             <w:vAlign w:val="center"/>
             <w:shd w:fill="E8E8E8"/>
+            <w:shd w:fill="E8E8E8"/>
           </w:tcPr>
           <w:p>
             <w:pPr>
@@ -3935,6 +3940,7 @@
             <w:shd w:val="clear" w:color="auto" w:fill="E8E8E8"/>
             <w:vAlign w:val="center"/>
             <w:shd w:fill="E8E8E8"/>
+            <w:shd w:fill="E8E8E8"/>
           </w:tcPr>
           <w:p>
             <w:pPr>
@@ -3960,6 +3966,7 @@
             <w:shd w:val="clear" w:color="auto" w:fill="E8E8E8"/>
             <w:vAlign w:val="center"/>
             <w:shd w:fill="E8E8E8"/>
+            <w:shd w:fill="E8E8E8"/>
           </w:tcPr>
           <w:p>
             <w:pPr>
@@ -3985,6 +3992,7 @@
             <w:shd w:val="clear" w:color="auto" w:fill="E8E8E8"/>
             <w:vAlign w:val="center"/>
             <w:shd w:fill="E8E8E8"/>
+            <w:shd w:fill="E8E8E8"/>
           </w:tcPr>
           <w:p>
             <w:pPr>
@@ -4010,6 +4018,7 @@
             <w:shd w:val="clear" w:color="auto" w:fill="E8E8E8"/>
             <w:vAlign w:val="center"/>
             <w:shd w:fill="E8E8E8"/>
+            <w:shd w:fill="E8E8E8"/>
           </w:tcPr>
           <w:p>
             <w:pPr>
@@ -4035,6 +4044,7 @@
             <w:shd w:val="clear" w:color="auto" w:fill="E8E8E8"/>
             <w:vAlign w:val="center"/>
             <w:shd w:fill="E8E8E8"/>
+            <w:shd w:fill="E8E8E8"/>
           </w:tcPr>
           <w:p>
             <w:pPr>
@@ -4060,6 +4070,7 @@
             <w:shd w:val="clear" w:color="auto" w:fill="E8E8E8"/>
             <w:vAlign w:val="center"/>
             <w:shd w:fill="E8E8E8"/>
+            <w:shd w:fill="E8E8E8"/>
           </w:tcPr>
           <w:p>
             <w:pPr>
@@ -4085,6 +4096,7 @@
             <w:shd w:val="clear" w:color="auto" w:fill="E8E8E8"/>
             <w:vAlign w:val="center"/>
             <w:shd w:fill="E8E8E8"/>
+            <w:shd w:fill="E8E8E8"/>
           </w:tcPr>
           <w:p>
             <w:pPr>
@@ -4110,6 +4122,7 @@
             <w:shd w:val="clear" w:color="auto" w:fill="E8E8E8"/>
             <w:vAlign w:val="center"/>
             <w:shd w:fill="E8E8E8"/>
+            <w:shd w:fill="E8E8E8"/>
           </w:tcPr>
           <w:p>
             <w:pPr>
@@ -4135,6 +4148,7 @@
             <w:shd w:val="clear" w:color="auto" w:fill="E8E8E8"/>
             <w:vAlign w:val="center"/>
             <w:shd w:fill="E8E8E8"/>
+            <w:shd w:fill="E8E8E8"/>
           </w:tcPr>
           <w:p>
             <w:pPr>
@@ -4160,6 +4174,7 @@
             <w:shd w:val="clear" w:color="auto" w:fill="E8E8E8"/>
             <w:vAlign w:val="center"/>
             <w:shd w:fill="E8E8E8"/>
+            <w:shd w:fill="E8E8E8"/>
           </w:tcPr>
           <w:p>
             <w:pPr>
@@ -4185,6 +4200,7 @@
             <w:shd w:val="clear" w:color="auto" w:fill="E8E8E8"/>
             <w:vAlign w:val="center"/>
             <w:shd w:fill="E8E8E8"/>
+            <w:shd w:fill="E8E8E8"/>
           </w:tcPr>
           <w:p>
             <w:pPr>
@@ -4210,6 +4226,7 @@
             <w:shd w:val="clear" w:color="auto" w:fill="E8E8E8"/>
             <w:vAlign w:val="center"/>
             <w:shd w:fill="E8E8E8"/>
+            <w:shd w:fill="E8E8E8"/>
           </w:tcPr>
           <w:p>
             <w:pPr>
@@ -4234,6 +4251,7 @@
             <w:tcW w:w="642" w:type="dxa"/>
             <w:shd w:val="clear" w:color="auto" w:fill="E8E8E8"/>
             <w:vAlign w:val="center"/>
+            <w:shd w:fill="E8E8E8"/>
             <w:shd w:fill="E8E8E8"/>
           </w:tcPr>
           <w:p>
@@ -6222,6 +6240,7 @@
             <w:tcW w:w="1000" w:type="dxa"/>
             <w:shd w:val="clear" w:color="auto" w:fill="F5F5F5"/>
             <w:shd w:fill="F5F5F5"/>
+            <w:shd w:fill="F5F5F5"/>
           </w:tcPr>
           <w:p>
             <w:pPr>
@@ -6246,6 +6265,7 @@
             <w:tcW w:w="642" w:type="dxa"/>
             <w:shd w:val="clear" w:color="auto" w:fill="F5F5F5"/>
             <w:shd w:fill="F5F5F5"/>
+            <w:shd w:fill="F5F5F5"/>
           </w:tcPr>
           <w:p>
             <w:pPr>
@@ -6270,6 +6290,7 @@
             <w:tcW w:w="642" w:type="dxa"/>
             <w:shd w:val="clear" w:color="auto" w:fill="F5F5F5"/>
             <w:shd w:fill="F5F5F5"/>
+            <w:shd w:fill="F5F5F5"/>
           </w:tcPr>
           <w:p>
             <w:pPr>
@@ -6294,6 +6315,7 @@
             <w:tcW w:w="642" w:type="dxa"/>
             <w:shd w:val="clear" w:color="auto" w:fill="F5F5F5"/>
             <w:shd w:fill="F5F5F5"/>
+            <w:shd w:fill="F5F5F5"/>
           </w:tcPr>
           <w:p>
             <w:pPr>
@@ -6318,6 +6340,7 @@
             <w:tcW w:w="642" w:type="dxa"/>
             <w:shd w:val="clear" w:color="auto" w:fill="F5F5F5"/>
             <w:shd w:fill="F5F5F5"/>
+            <w:shd w:fill="F5F5F5"/>
           </w:tcPr>
           <w:p>
             <w:pPr>
@@ -6342,6 +6365,7 @@
             <w:tcW w:w="642" w:type="dxa"/>
             <w:shd w:val="clear" w:color="auto" w:fill="F5F5F5"/>
             <w:shd w:fill="F5F5F5"/>
+            <w:shd w:fill="F5F5F5"/>
           </w:tcPr>
           <w:p>
             <w:pPr>
@@ -6366,6 +6390,7 @@
             <w:tcW w:w="642" w:type="dxa"/>
             <w:shd w:val="clear" w:color="auto" w:fill="F5F5F5"/>
             <w:shd w:fill="F5F5F5"/>
+            <w:shd w:fill="F5F5F5"/>
           </w:tcPr>
           <w:p>
             <w:pPr>
@@ -6390,6 +6415,7 @@
             <w:tcW w:w="642" w:type="dxa"/>
             <w:shd w:val="clear" w:color="auto" w:fill="F5F5F5"/>
             <w:shd w:fill="F5F5F5"/>
+            <w:shd w:fill="F5F5F5"/>
           </w:tcPr>
           <w:p>
             <w:pPr>
@@ -6414,6 +6440,7 @@
             <w:tcW w:w="642" w:type="dxa"/>
             <w:shd w:val="clear" w:color="auto" w:fill="F5F5F5"/>
             <w:shd w:fill="F5F5F5"/>
+            <w:shd w:fill="F5F5F5"/>
           </w:tcPr>
           <w:p>
             <w:pPr>
@@ -6438,6 +6465,7 @@
             <w:tcW w:w="642" w:type="dxa"/>
             <w:shd w:val="clear" w:color="auto" w:fill="F5F5F5"/>
             <w:shd w:fill="F5F5F5"/>
+            <w:shd w:fill="F5F5F5"/>
           </w:tcPr>
           <w:p>
             <w:pPr>
@@ -6462,6 +6490,7 @@
             <w:tcW w:w="642" w:type="dxa"/>
             <w:shd w:val="clear" w:color="auto" w:fill="F5F5F5"/>
             <w:shd w:fill="F5F5F5"/>
+            <w:shd w:fill="F5F5F5"/>
           </w:tcPr>
           <w:p>
             <w:pPr>
@@ -6486,6 +6515,7 @@
             <w:tcW w:w="642" w:type="dxa"/>
             <w:shd w:val="clear" w:color="auto" w:fill="F5F5F5"/>
             <w:shd w:fill="F5F5F5"/>
+            <w:shd w:fill="F5F5F5"/>
           </w:tcPr>
           <w:p>
             <w:pPr>
@@ -6510,6 +6540,7 @@
             <w:tcW w:w="642" w:type="dxa"/>
             <w:shd w:val="clear" w:color="auto" w:fill="F5F5F5"/>
             <w:shd w:fill="F5F5F5"/>
+            <w:shd w:fill="F5F5F5"/>
           </w:tcPr>
           <w:p>
             <w:pPr>
@@ -6533,6 +6564,7 @@
           <w:tcPr>
             <w:tcW w:w="642" w:type="dxa"/>
             <w:shd w:val="clear" w:color="auto" w:fill="F5F5F5"/>
+            <w:shd w:fill="F5F5F5"/>
             <w:shd w:fill="F5F5F5"/>
           </w:tcPr>
           <w:p>
@@ -6629,6 +6661,7 @@
             <w:shd w:val="clear" w:color="auto" w:fill="E8E8E8"/>
             <w:vAlign w:val="center"/>
             <w:shd w:fill="E8E8E8"/>
+            <w:shd w:fill="E8E8E8"/>
           </w:tcPr>
           <w:p>
             <w:pPr>
@@ -6654,6 +6687,7 @@
             <w:shd w:val="clear" w:color="auto" w:fill="E8E8E8"/>
             <w:vAlign w:val="center"/>
             <w:shd w:fill="E8E8E8"/>
+            <w:shd w:fill="E8E8E8"/>
           </w:tcPr>
           <w:p>
             <w:pPr>
@@ -6678,6 +6712,7 @@
             <w:tcW w:w="7500" w:type="dxa"/>
             <w:shd w:val="clear" w:color="auto" w:fill="E8E8E8"/>
             <w:vAlign w:val="center"/>
+            <w:shd w:fill="E8E8E8"/>
             <w:shd w:fill="E8E8E8"/>
           </w:tcPr>
           <w:p>
@@ -8778,6 +8813,7 @@
             <w:shd w:val="clear" w:color="auto" w:fill="E8E8E8"/>
             <w:vAlign w:val="center"/>
             <w:shd w:fill="E8E8E8"/>
+            <w:shd w:fill="E8E8E8"/>
           </w:tcPr>
           <w:p>
             <w:pPr>
@@ -8803,6 +8839,7 @@
             <w:shd w:val="clear" w:color="auto" w:fill="E8E8E8"/>
             <w:vAlign w:val="center"/>
             <w:shd w:fill="E8E8E8"/>
+            <w:shd w:fill="E8E8E8"/>
           </w:tcPr>
           <w:p>
             <w:pPr>
@@ -8827,6 +8864,7 @@
             <w:tcW w:w="6400" w:type="dxa"/>
             <w:shd w:val="clear" w:color="auto" w:fill="E8E8E8"/>
             <w:vAlign w:val="center"/>
+            <w:shd w:fill="E8E8E8"/>
             <w:shd w:fill="E8E8E8"/>
           </w:tcPr>
           <w:p>
@@ -12597,6 +12635,7 @@
             <w:shd w:val="clear" w:color="auto" w:fill="DEEAF6"/>
             <w:vAlign w:val="center"/>
             <w:shd w:fill="F2F2F2"/>
+            <w:shd w:fill="F2F2F2"/>
           </w:tcPr>
           <w:p>
             <w:pPr>
@@ -12652,6 +12691,7 @@
             <w:tcW w:w="3800" w:type="dxa"/>
             <w:vAlign w:val="center"/>
             <w:shd w:fill="F2F2F2"/>
+            <w:shd w:fill="F2F2F2"/>
           </w:tcPr>
           <w:p>
             <w:pPr>
@@ -12706,6 +12746,7 @@
             <w:tcW w:w="3800" w:type="dxa"/>
             <w:vAlign w:val="center"/>
             <w:shd w:fill="F2F2F2"/>
+            <w:shd w:fill="F2F2F2"/>
           </w:tcPr>
           <w:p>
             <w:pPr>
@@ -12760,6 +12801,7 @@
             <w:tcW w:w="3800" w:type="dxa"/>
             <w:vAlign w:val="center"/>
             <w:shd w:fill="F2F2F2"/>
+            <w:shd w:fill="F2F2F2"/>
           </w:tcPr>
           <w:p>
             <w:pPr>
@@ -12814,6 +12856,7 @@
             <w:tcW w:w="3800" w:type="dxa"/>
             <w:vAlign w:val="center"/>
             <w:shd w:fill="F2F2F2"/>
+            <w:shd w:fill="F2F2F2"/>
           </w:tcPr>
           <w:p>
             <w:pPr>
@@ -12868,6 +12911,7 @@
             <w:tcW w:w="3800" w:type="dxa"/>
             <w:vAlign w:val="center"/>
             <w:shd w:fill="F2F2F2"/>
+            <w:shd w:fill="F2F2F2"/>
           </w:tcPr>
           <w:p>
             <w:pPr>
@@ -12922,6 +12966,7 @@
             <w:tcW w:w="3800" w:type="dxa"/>
             <w:vAlign w:val="center"/>
             <w:shd w:fill="F2F2F2"/>
+            <w:shd w:fill="F2F2F2"/>
           </w:tcPr>
           <w:p>
             <w:pPr>
@@ -12975,6 +13020,7 @@
           <w:tcPr>
             <w:tcW w:w="3800" w:type="dxa"/>
             <w:vAlign w:val="center"/>
+            <w:shd w:fill="F2F2F2"/>
             <w:shd w:fill="F2F2F2"/>
           </w:tcPr>
           <w:p>
@@ -13118,6 +13164,7 @@
             <w:shd w:val="clear" w:color="auto" w:fill="DEEAF6"/>
             <w:vAlign w:val="center"/>
             <w:shd w:fill="F2F2F2"/>
+            <w:shd w:fill="F2F2F2"/>
           </w:tcPr>
           <w:p>
             <w:pPr>
@@ -13173,6 +13220,7 @@
             <w:tcW w:w="4400" w:type="dxa"/>
             <w:vAlign w:val="center"/>
             <w:shd w:fill="F2F2F2"/>
+            <w:shd w:fill="F2F2F2"/>
           </w:tcPr>
           <w:p>
             <w:pPr>
@@ -13227,6 +13275,7 @@
             <w:tcW w:w="4400" w:type="dxa"/>
             <w:vAlign w:val="center"/>
             <w:shd w:fill="F2F2F2"/>
+            <w:shd w:fill="F2F2F2"/>
           </w:tcPr>
           <w:p>
             <w:pPr>
@@ -13281,6 +13330,7 @@
             <w:tcW w:w="4400" w:type="dxa"/>
             <w:vAlign w:val="center"/>
             <w:shd w:fill="F2F2F2"/>
+            <w:shd w:fill="F2F2F2"/>
           </w:tcPr>
           <w:p>
             <w:pPr>
@@ -13335,6 +13385,7 @@
             <w:tcW w:w="4400" w:type="dxa"/>
             <w:vAlign w:val="center"/>
             <w:shd w:fill="F2F2F2"/>
+            <w:shd w:fill="F2F2F2"/>
           </w:tcPr>
           <w:p>
             <w:pPr>
@@ -13389,6 +13440,7 @@
             <w:tcW w:w="4400" w:type="dxa"/>
             <w:vAlign w:val="center"/>
             <w:shd w:fill="F2F2F2"/>
+            <w:shd w:fill="F2F2F2"/>
           </w:tcPr>
           <w:p>
             <w:pPr>
@@ -13443,6 +13495,7 @@
             <w:tcW w:w="4400" w:type="dxa"/>
             <w:vAlign w:val="center"/>
             <w:shd w:fill="F2F2F2"/>
+            <w:shd w:fill="F2F2F2"/>
           </w:tcPr>
           <w:p>
             <w:pPr>
@@ -13497,6 +13550,7 @@
             <w:tcW w:w="4400" w:type="dxa"/>
             <w:vAlign w:val="center"/>
             <w:shd w:fill="F2F2F2"/>
+            <w:shd w:fill="F2F2F2"/>
           </w:tcPr>
           <w:p>
             <w:pPr>
@@ -13551,6 +13605,7 @@
             <w:tcW w:w="4400" w:type="dxa"/>
             <w:vAlign w:val="center"/>
             <w:shd w:fill="F2F2F2"/>
+            <w:shd w:fill="F2F2F2"/>
           </w:tcPr>
           <w:p>
             <w:pPr>
@@ -13604,6 +13659,7 @@
           <w:tcPr>
             <w:tcW w:w="4400" w:type="dxa"/>
             <w:vAlign w:val="center"/>
+            <w:shd w:fill="F2F2F2"/>
             <w:shd w:fill="F2F2F2"/>
           </w:tcPr>
           <w:p>
@@ -16973,6 +17029,7 @@
             <w:shd w:val="clear" w:color="auto" w:fill="DEEAF6"/>
             <w:vAlign w:val="center"/>
             <w:shd w:fill="E8E8E8"/>
+            <w:shd w:fill="E8E8E8"/>
           </w:tcPr>
           <w:p>
             <w:pPr>
@@ -16998,6 +17055,7 @@
             <w:shd w:val="clear" w:color="auto" w:fill="DEEAF6"/>
             <w:vAlign w:val="center"/>
             <w:shd w:fill="E8E8E8"/>
+            <w:shd w:fill="E8E8E8"/>
           </w:tcPr>
           <w:p>
             <w:pPr>
@@ -17023,6 +17081,7 @@
             <w:shd w:val="clear" w:color="auto" w:fill="DEEAF6"/>
             <w:vAlign w:val="center"/>
             <w:shd w:fill="E8E8E8"/>
+            <w:shd w:fill="E8E8E8"/>
           </w:tcPr>
           <w:p>
             <w:pPr>
@@ -17047,6 +17106,7 @@
             <w:tcW w:w="4200" w:type="dxa"/>
             <w:shd w:val="clear" w:color="auto" w:fill="DEEAF6"/>
             <w:vAlign w:val="center"/>
+            <w:shd w:fill="E8E8E8"/>
             <w:shd w:fill="E8E8E8"/>
           </w:tcPr>
           <w:p>
@@ -17460,6 +17520,7 @@
           <w:tcPr>
             <w:tcW w:type="dxa" w:w="2200"/>
             <w:shd w:fill="F5F5F5"/>
+            <w:shd w:fill="F5F5F5"/>
           </w:tcPr>
           <w:p>
             <w:pPr>
@@ -17483,6 +17544,7 @@
           <w:tcPr>
             <w:tcW w:type="dxa" w:w="1500"/>
             <w:shd w:fill="F5F5F5"/>
+            <w:shd w:fill="F5F5F5"/>
           </w:tcPr>
           <w:p>
             <w:pPr>
@@ -17506,6 +17568,7 @@
           <w:tcPr>
             <w:tcW w:type="dxa" w:w="2100"/>
             <w:shd w:fill="F5F5F5"/>
+            <w:shd w:fill="F5F5F5"/>
           </w:tcPr>
           <w:p>
             <w:pPr>
@@ -17528,6 +17591,7 @@
         <w:tc>
           <w:tcPr>
             <w:tcW w:type="dxa" w:w="4200"/>
+            <w:shd w:fill="F5F5F5"/>
             <w:shd w:fill="F5F5F5"/>
           </w:tcPr>
           <w:p>
@@ -23611,7 +23675,7 @@
         <w:br/>
         <w:t>• Y Akshay Raj (Roll No. 24VE1A66C8, 20% contribution — Full-Stack &amp; Telemetry Engineer):</w:t>
         <w:br/>
-        <w:t xml:space="preserve">  Architected the asynchronous FastAPI backend server; developed the interactive HTML5 drawing canvas and Apple Pro design system; integrated real-time inference telemetry HUD, top-K probability distribution charts, and error matrix inspection; executed comprehensive automated test suite (33/33 passing tests).</w:t>
+        <w:t xml:space="preserve">  Architected the asynchronous FastAPI backend server; developed the interactive HTML5 drawing canvas and Apple Pro design system; integrated real-time inference telemetry HUD, top-K probability distribution charts, and error matrix inspection; executed comprehensive automated test suite (35/35 passing tests).</w:t>
       </w:r>
     </w:p>
     <w:tbl>
@@ -23650,20 +23714,21 @@
             <w:tcW w:w="800" w:type="dxa"/>
             <w:shd w:val="clear" w:color="auto" w:fill="DEEAF6"/>
             <w:vAlign w:val="center"/>
-          </w:tcPr>
-          <w:p>
-            <w:pPr>
-              <w:keepNext/>
-              <w:spacing w:after="40" w:line="264" w:lineRule="auto"/>
-              <w:jc w:val="both"/>
-            </w:pPr>
-            <w:r>
-              <w:rPr>
-                <w:rFonts w:ascii="Times New Roman" w:hAnsi="Times New Roman"/>
-                <w:b/>
-                <w:bCs/>
-                <w:sz w:val="20"/>
-                <w:szCs w:val="20"/>
+            <w:shd w:fill="E8E8E8"/>
+          </w:tcPr>
+          <w:p>
+            <w:pPr>
+              <w:spacing w:before="40" w:after="40" w:line="276" w:lineRule="auto"/>
+              <w:jc w:val="center"/>
+            </w:pPr>
+            <w:r/>
+            <w:r>
+              <w:rPr>
+                <w:rFonts w:ascii="Times New Roman" w:hAnsi="Times New Roman"/>
+                <w:b/>
+                <w:i w:val="0"/>
+                <w:color w:val="1A1A1A"/>
+                <w:sz w:val="20"/>
               </w:rPr>
               <w:t>S.No</w:t>
             </w:r>
@@ -23674,22 +23739,23 @@
             <w:tcW w:w="2600" w:type="dxa"/>
             <w:shd w:val="clear" w:color="auto" w:fill="DEEAF6"/>
             <w:vAlign w:val="center"/>
-          </w:tcPr>
-          <w:p>
-            <w:pPr>
-              <w:keepNext/>
-              <w:spacing w:after="40" w:line="264" w:lineRule="auto"/>
-              <w:jc w:val="both"/>
-            </w:pPr>
-            <w:r>
-              <w:rPr>
-                <w:rFonts w:ascii="Times New Roman" w:hAnsi="Times New Roman"/>
-                <w:b/>
-                <w:bCs/>
-                <w:sz w:val="20"/>
-                <w:szCs w:val="20"/>
-              </w:rPr>
-              <w:t>Task / Module</w:t>
+            <w:shd w:fill="E8E8E8"/>
+          </w:tcPr>
+          <w:p>
+            <w:pPr>
+              <w:spacing w:before="40" w:after="40" w:line="276" w:lineRule="auto"/>
+              <w:jc w:val="center"/>
+            </w:pPr>
+            <w:r/>
+            <w:r>
+              <w:rPr>
+                <w:rFonts w:ascii="Times New Roman" w:hAnsi="Times New Roman"/>
+                <w:b/>
+                <w:i w:val="0"/>
+                <w:color w:val="1A1A1A"/>
+                <w:sz w:val="20"/>
+              </w:rPr>
+              <w:t>Student Name &amp; Roll No.</w:t>
             </w:r>
           </w:p>
         </w:tc>
@@ -23698,22 +23764,23 @@
             <w:tcW w:w="4200" w:type="dxa"/>
             <w:shd w:val="clear" w:color="auto" w:fill="DEEAF6"/>
             <w:vAlign w:val="center"/>
-          </w:tcPr>
-          <w:p>
-            <w:pPr>
-              <w:keepNext/>
-              <w:spacing w:after="40" w:line="264" w:lineRule="auto"/>
-              <w:jc w:val="both"/>
-            </w:pPr>
-            <w:r>
-              <w:rPr>
-                <w:rFonts w:ascii="Times New Roman" w:hAnsi="Times New Roman"/>
-                <w:b/>
-                <w:bCs/>
-                <w:sz w:val="20"/>
-                <w:szCs w:val="20"/>
-              </w:rPr>
-              <w:t>Description</w:t>
+            <w:shd w:fill="E8E8E8"/>
+          </w:tcPr>
+          <w:p>
+            <w:pPr>
+              <w:spacing w:before="40" w:after="40" w:line="276" w:lineRule="auto"/>
+              <w:jc w:val="center"/>
+            </w:pPr>
+            <w:r/>
+            <w:r>
+              <w:rPr>
+                <w:rFonts w:ascii="Times New Roman" w:hAnsi="Times New Roman"/>
+                <w:b/>
+                <w:i w:val="0"/>
+                <w:color w:val="1A1A1A"/>
+                <w:sz w:val="20"/>
+              </w:rPr>
+              <w:t>Module Responsibilities &amp; Description</w:t>
             </w:r>
           </w:p>
         </w:tc>
@@ -23722,22 +23789,23 @@
             <w:tcW w:w="2400" w:type="dxa"/>
             <w:shd w:val="clear" w:color="auto" w:fill="DEEAF6"/>
             <w:vAlign w:val="center"/>
-          </w:tcPr>
-          <w:p>
-            <w:pPr>
-              <w:keepNext/>
-              <w:spacing w:after="40" w:line="264" w:lineRule="auto"/>
-              <w:jc w:val="both"/>
-            </w:pPr>
-            <w:r>
-              <w:rPr>
-                <w:rFonts w:ascii="Times New Roman" w:hAnsi="Times New Roman"/>
-                <w:b/>
-                <w:bCs/>
-                <w:sz w:val="20"/>
-                <w:szCs w:val="20"/>
-              </w:rPr>
-              <w:t>Done by (Roll No.)</w:t>
+            <w:shd w:fill="E8E8E8"/>
+          </w:tcPr>
+          <w:p>
+            <w:pPr>
+              <w:spacing w:before="40" w:after="40" w:line="276" w:lineRule="auto"/>
+              <w:jc w:val="center"/>
+            </w:pPr>
+            <w:r/>
+            <w:r>
+              <w:rPr>
+                <w:rFonts w:ascii="Times New Roman" w:hAnsi="Times New Roman"/>
+                <w:b/>
+                <w:i w:val="0"/>
+                <w:color w:val="1A1A1A"/>
+                <w:sz w:val="20"/>
+              </w:rPr>
+              <w:t>Contribution (%)</w:t>
             </w:r>
           </w:p>
         </w:tc>
@@ -23755,14 +23823,17 @@
           </w:tcPr>
           <w:p>
             <w:pPr>
-              <w:spacing w:before="40" w:after="40"/>
-              <w:jc w:val="both"/>
-            </w:pPr>
-            <w:r>
-              <w:rPr>
-                <w:rFonts w:ascii="Times New Roman" w:hAnsi="Times New Roman"/>
-                <w:color w:val="000000"/>
-                <w:sz w:val="20"/>
+              <w:spacing w:before="40" w:after="40" w:line="276" w:lineRule="auto"/>
+              <w:jc w:val="center"/>
+            </w:pPr>
+            <w:r/>
+            <w:r>
+              <w:rPr>
+                <w:rFonts w:ascii="Times New Roman" w:hAnsi="Times New Roman"/>
+                <w:b w:val="0"/>
+                <w:i w:val="0"/>
+                <w:color w:val="1A1A1A"/>
+                <w:sz w:val="19"/>
               </w:rPr>
               <w:t>1</w:t>
             </w:r>
@@ -23775,17 +23846,21 @@
           </w:tcPr>
           <w:p>
             <w:pPr>
-              <w:spacing w:before="40" w:after="40"/>
-              <w:jc w:val="both"/>
-            </w:pPr>
-            <w:r>
-              <w:rPr>
-                <w:rFonts w:ascii="Times New Roman" w:hAnsi="Times New Roman"/>
-                <w:b/>
-                <w:color w:val="000000"/>
-                <w:sz w:val="20"/>
-              </w:rPr>
-              <w:t>G. Tejaswi (22071A6601)</w:t>
+              <w:spacing w:before="40" w:after="40" w:line="276" w:lineRule="auto"/>
+              <w:jc w:val="center"/>
+            </w:pPr>
+            <w:r/>
+            <w:r>
+              <w:rPr>
+                <w:rFonts w:ascii="Times New Roman" w:hAnsi="Times New Roman"/>
+                <w:b/>
+                <w:i w:val="0"/>
+                <w:color w:val="1A1A1A"/>
+                <w:sz w:val="19"/>
+              </w:rPr>
+              <w:t>M TEJAS YADAV</w:t>
+              <w:br/>
+              <w:t>(24VE1A6695)</w:t>
             </w:r>
           </w:p>
         </w:tc>
@@ -23796,16 +23871,21 @@
           </w:tcPr>
           <w:p>
             <w:pPr>
-              <w:spacing w:before="40" w:after="40"/>
-              <w:jc w:val="both"/>
-            </w:pPr>
-            <w:r>
-              <w:rPr>
-                <w:rFonts w:ascii="Times New Roman" w:hAnsi="Times New Roman"/>
-                <w:color w:val="000000"/>
-                <w:sz w:val="20"/>
-              </w:rPr>
-              <w:t>Deep ConvNet Architecture, Training Loop, Grad-CAM XAI, Report Formulation</w:t>
+              <w:spacing w:before="40" w:after="40" w:line="276" w:lineRule="auto"/>
+              <w:jc w:val="left"/>
+            </w:pPr>
+            <w:r/>
+            <w:r>
+              <w:rPr>
+                <w:rFonts w:ascii="Times New Roman" w:hAnsi="Times New Roman"/>
+                <w:b w:val="0"/>
+                <w:i w:val="0"/>
+                <w:color w:val="1A1A1A"/>
+                <w:sz w:val="19"/>
+              </w:rPr>
+              <w:t>Lead Architect &amp; Deep Learning Engineer:</w:t>
+              <w:br/>
+              <w:t>Formulated end-to-end mathematical and system architecture; designed DigitVision DeepConvNet with Global Average Pooling; engineered Keras 3 training and convergence pipeline; implemented Grad-CAM and saliency visual explainability modules; coordinated technical report formulation and NBA outcome mapping.</w:t>
             </w:r>
           </w:p>
         </w:tc>
@@ -23816,13 +23896,16 @@
           </w:tcPr>
           <w:p>
             <w:pPr>
-              <w:spacing w:before="40" w:after="40"/>
-              <w:jc w:val="both"/>
-            </w:pPr>
-            <w:r>
-              <w:rPr>
-                <w:rFonts w:ascii="Times New Roman" w:hAnsi="Times New Roman"/>
-                <w:color w:val="000000"/>
+              <w:spacing w:before="40" w:after="40" w:line="276" w:lineRule="auto"/>
+              <w:jc w:val="center"/>
+            </w:pPr>
+            <w:r/>
+            <w:r>
+              <w:rPr>
+                <w:rFonts w:ascii="Times New Roman" w:hAnsi="Times New Roman"/>
+                <w:b/>
+                <w:i w:val="0"/>
+                <w:color w:val="1A1A1A"/>
                 <w:sz w:val="20"/>
               </w:rPr>
               <w:t>45%</w:t>
@@ -23843,14 +23926,17 @@
           </w:tcPr>
           <w:p>
             <w:pPr>
-              <w:spacing w:before="40" w:after="40"/>
-              <w:jc w:val="both"/>
-            </w:pPr>
-            <w:r>
-              <w:rPr>
-                <w:rFonts w:ascii="Times New Roman" w:hAnsi="Times New Roman"/>
-                <w:color w:val="000000"/>
-                <w:sz w:val="20"/>
+              <w:spacing w:before="40" w:after="40" w:line="276" w:lineRule="auto"/>
+              <w:jc w:val="center"/>
+            </w:pPr>
+            <w:r/>
+            <w:r>
+              <w:rPr>
+                <w:rFonts w:ascii="Times New Roman" w:hAnsi="Times New Roman"/>
+                <w:b w:val="0"/>
+                <w:i w:val="0"/>
+                <w:color w:val="1A1A1A"/>
+                <w:sz w:val="19"/>
               </w:rPr>
               <w:t>2</w:t>
             </w:r>
@@ -23863,17 +23949,21 @@
           </w:tcPr>
           <w:p>
             <w:pPr>
-              <w:spacing w:before="40" w:after="40"/>
-              <w:jc w:val="both"/>
-            </w:pPr>
-            <w:r>
-              <w:rPr>
-                <w:rFonts w:ascii="Times New Roman" w:hAnsi="Times New Roman"/>
-                <w:b/>
-                <w:color w:val="000000"/>
-                <w:sz w:val="20"/>
-              </w:rPr>
-              <w:t>K. Rahul (22071A6602)</w:t>
+              <w:spacing w:before="40" w:after="40" w:line="276" w:lineRule="auto"/>
+              <w:jc w:val="center"/>
+            </w:pPr>
+            <w:r/>
+            <w:r>
+              <w:rPr>
+                <w:rFonts w:ascii="Times New Roman" w:hAnsi="Times New Roman"/>
+                <w:b/>
+                <w:i w:val="0"/>
+                <w:color w:val="1A1A1A"/>
+                <w:sz w:val="19"/>
+              </w:rPr>
+              <w:t>K Charan Teja</w:t>
+              <w:br/>
+              <w:t>(24VE1A6692)</w:t>
             </w:r>
           </w:p>
         </w:tc>
@@ -23884,16 +23974,21 @@
           </w:tcPr>
           <w:p>
             <w:pPr>
-              <w:spacing w:before="40" w:after="40"/>
-              <w:jc w:val="both"/>
-            </w:pPr>
-            <w:r>
-              <w:rPr>
-                <w:rFonts w:ascii="Times New Roman" w:hAnsi="Times New Roman"/>
-                <w:color w:val="000000"/>
-                <w:sz w:val="20"/>
-              </w:rPr>
-              <w:t>Canonical Invariant Preprocessing, Classical Baselines, Temperature Scaling</w:t>
+              <w:spacing w:before="40" w:after="40" w:line="276" w:lineRule="auto"/>
+              <w:jc w:val="left"/>
+            </w:pPr>
+            <w:r/>
+            <w:r>
+              <w:rPr>
+                <w:rFonts w:ascii="Times New Roman" w:hAnsi="Times New Roman"/>
+                <w:b w:val="0"/>
+                <w:i w:val="0"/>
+                <w:color w:val="1A1A1A"/>
+                <w:sz w:val="19"/>
+              </w:rPr>
+              <w:t>ML Engineer &amp; Statistical Analyst:</w:t>
+              <w:br/>
+              <w:t>Implemented the 7-stage canonical invariant preprocessing pipeline (Otsu adaptive thresholding, aspect-preserving bounding box scaling, center-of-mass translation); trained and benchmarked classical machine learning baselines (Logistic Regression, Random Forest, SVM-RBF); executed temperature scaling calibration (ECE minimization); conducted exploratory K-Means clustering analysis.</w:t>
             </w:r>
           </w:p>
         </w:tc>
@@ -23904,13 +23999,16 @@
           </w:tcPr>
           <w:p>
             <w:pPr>
-              <w:spacing w:before="40" w:after="40"/>
-              <w:jc w:val="both"/>
-            </w:pPr>
-            <w:r>
-              <w:rPr>
-                <w:rFonts w:ascii="Times New Roman" w:hAnsi="Times New Roman"/>
-                <w:color w:val="000000"/>
+              <w:spacing w:before="40" w:after="40" w:line="276" w:lineRule="auto"/>
+              <w:jc w:val="center"/>
+            </w:pPr>
+            <w:r/>
+            <w:r>
+              <w:rPr>
+                <w:rFonts w:ascii="Times New Roman" w:hAnsi="Times New Roman"/>
+                <w:b/>
+                <w:i w:val="0"/>
+                <w:color w:val="1A1A1A"/>
                 <w:sz w:val="20"/>
               </w:rPr>
               <w:t>35%</w:t>
@@ -23931,14 +24029,17 @@
           </w:tcPr>
           <w:p>
             <w:pPr>
-              <w:spacing w:before="40" w:after="40"/>
-              <w:jc w:val="both"/>
-            </w:pPr>
-            <w:r>
-              <w:rPr>
-                <w:rFonts w:ascii="Times New Roman" w:hAnsi="Times New Roman"/>
-                <w:color w:val="000000"/>
-                <w:sz w:val="20"/>
+              <w:spacing w:before="40" w:after="40" w:line="276" w:lineRule="auto"/>
+              <w:jc w:val="center"/>
+            </w:pPr>
+            <w:r/>
+            <w:r>
+              <w:rPr>
+                <w:rFonts w:ascii="Times New Roman" w:hAnsi="Times New Roman"/>
+                <w:b w:val="0"/>
+                <w:i w:val="0"/>
+                <w:color w:val="1A1A1A"/>
+                <w:sz w:val="19"/>
               </w:rPr>
               <w:t>3</w:t>
             </w:r>
@@ -23951,17 +24052,21 @@
           </w:tcPr>
           <w:p>
             <w:pPr>
-              <w:spacing w:before="40" w:after="40"/>
-              <w:jc w:val="both"/>
-            </w:pPr>
-            <w:r>
-              <w:rPr>
-                <w:rFonts w:ascii="Times New Roman" w:hAnsi="Times New Roman"/>
-                <w:b/>
-                <w:color w:val="000000"/>
-                <w:sz w:val="20"/>
-              </w:rPr>
-              <w:t>V. Ananya (22071A6603)</w:t>
+              <w:spacing w:before="40" w:after="40" w:line="276" w:lineRule="auto"/>
+              <w:jc w:val="center"/>
+            </w:pPr>
+            <w:r/>
+            <w:r>
+              <w:rPr>
+                <w:rFonts w:ascii="Times New Roman" w:hAnsi="Times New Roman"/>
+                <w:b/>
+                <w:i w:val="0"/>
+                <w:color w:val="1A1A1A"/>
+                <w:sz w:val="19"/>
+              </w:rPr>
+              <w:t>Y Akshay Raj</w:t>
+              <w:br/>
+              <w:t>(24VE1A66C8)</w:t>
             </w:r>
           </w:p>
         </w:tc>
@@ -23972,16 +24077,21 @@
           </w:tcPr>
           <w:p>
             <w:pPr>
-              <w:spacing w:before="40" w:after="40"/>
-              <w:jc w:val="both"/>
-            </w:pPr>
-            <w:r>
-              <w:rPr>
-                <w:rFonts w:ascii="Times New Roman" w:hAnsi="Times New Roman"/>
-                <w:color w:val="000000"/>
-                <w:sz w:val="20"/>
-              </w:rPr>
-              <w:t>FastAPI Mission Control Server, Interactive HTML5 Canvas UI, Evaluation Telemetry</w:t>
+              <w:spacing w:before="40" w:after="40" w:line="276" w:lineRule="auto"/>
+              <w:jc w:val="left"/>
+            </w:pPr>
+            <w:r/>
+            <w:r>
+              <w:rPr>
+                <w:rFonts w:ascii="Times New Roman" w:hAnsi="Times New Roman"/>
+                <w:b w:val="0"/>
+                <w:i w:val="0"/>
+                <w:color w:val="1A1A1A"/>
+                <w:sz w:val="19"/>
+              </w:rPr>
+              <w:t>Full-Stack &amp; Telemetry Engineer:</w:t>
+              <w:br/>
+              <w:t>Architected the asynchronous FastAPI backend server; developed interactive HTML5 drawing canvas and Apple Pro design system; integrated real-time inference telemetry HUD, top-K probability distribution charts, and error matrix inspection; executed comprehensive automated test suite (35/35 passing tests).</w:t>
             </w:r>
           </w:p>
         </w:tc>
@@ -23992,105 +24102,19 @@
           </w:tcPr>
           <w:p>
             <w:pPr>
-              <w:spacing w:before="40" w:after="40"/>
-              <w:jc w:val="both"/>
-            </w:pPr>
-            <w:r>
-              <w:rPr>
-                <w:rFonts w:ascii="Times New Roman" w:hAnsi="Times New Roman"/>
-                <w:color w:val="000000"/>
+              <w:spacing w:before="40" w:after="40" w:line="276" w:lineRule="auto"/>
+              <w:jc w:val="center"/>
+            </w:pPr>
+            <w:r/>
+            <w:r>
+              <w:rPr>
+                <w:rFonts w:ascii="Times New Roman" w:hAnsi="Times New Roman"/>
+                <w:b/>
+                <w:i w:val="0"/>
+                <w:color w:val="1A1A1A"/>
                 <w:sz w:val="20"/>
               </w:rPr>
               <w:t>20%</w:t>
-            </w:r>
-          </w:p>
-        </w:tc>
-      </w:tr>
-      <w:tr>
-        <w:trPr>
-          <w:cantSplit/>
-          <w:trHeight w:val="440"/>
-          <w:jc w:val="center"/>
-        </w:trPr>
-        <w:tc>
-          <w:tcPr>
-            <w:tcW w:w="800" w:type="dxa"/>
-            <w:vAlign w:val="center"/>
-          </w:tcPr>
-          <w:p>
-            <w:pPr>
-              <w:spacing w:before="40" w:after="40"/>
-              <w:jc w:val="both"/>
-            </w:pPr>
-            <w:r>
-              <w:rPr>
-                <w:rFonts w:ascii="Times New Roman" w:hAnsi="Times New Roman"/>
-                <w:b/>
-                <w:color w:val="000000"/>
-                <w:sz w:val="20"/>
-              </w:rPr>
-              <w:t>4</w:t>
-            </w:r>
-          </w:p>
-        </w:tc>
-        <w:tc>
-          <w:tcPr>
-            <w:tcW w:w="2600" w:type="dxa"/>
-            <w:vAlign w:val="center"/>
-          </w:tcPr>
-          <w:p>
-            <w:pPr>
-              <w:spacing w:before="40" w:after="40"/>
-              <w:jc w:val="both"/>
-            </w:pPr>
-            <w:r>
-              <w:rPr>
-                <w:rFonts w:ascii="Times New Roman" w:hAnsi="Times New Roman"/>
-                <w:b/>
-                <w:color w:val="000000"/>
-                <w:sz w:val="20"/>
-              </w:rPr>
-              <w:t>Mission Control Web Deployment &amp; QA</w:t>
-            </w:r>
-          </w:p>
-        </w:tc>
-        <w:tc>
-          <w:tcPr>
-            <w:tcW w:w="4200" w:type="dxa"/>
-            <w:vAlign w:val="center"/>
-          </w:tcPr>
-          <w:p>
-            <w:pPr>
-              <w:spacing w:before="40" w:after="40"/>
-              <w:jc w:val="both"/>
-            </w:pPr>
-            <w:r>
-              <w:rPr>
-                <w:rFonts w:ascii="Times New Roman" w:hAnsi="Times New Roman"/>
-                <w:color w:val="000000"/>
-                <w:sz w:val="20"/>
-              </w:rPr>
-              <w:t>Built FastAPI backend, HTML5 canvas UI, automated test suite, and audit verification.</w:t>
-            </w:r>
-          </w:p>
-        </w:tc>
-        <w:tc>
-          <w:tcPr>
-            <w:tcW w:w="2400" w:type="dxa"/>
-            <w:vAlign w:val="center"/>
-          </w:tcPr>
-          <w:p>
-            <w:pPr>
-              <w:spacing w:before="40" w:after="40"/>
-              <w:jc w:val="both"/>
-            </w:pPr>
-            <w:r>
-              <w:rPr>
-                <w:rFonts w:ascii="Times New Roman" w:hAnsi="Times New Roman"/>
-                <w:color w:val="000000"/>
-                <w:sz w:val="20"/>
-              </w:rPr>
-              <w:t>22VE1A6704</w:t>
             </w:r>
           </w:p>
         </w:tc>

</xml_diff>

<commit_message>
docs: add comprehensive academic viva preparation guide and final project release reports
</commit_message>
<xml_diff>
--- a/ML-Project Documentation.docx
+++ b/ML-Project Documentation.docx
@@ -3146,6 +3146,7 @@
             <w:vAlign w:val="center"/>
             <w:shd w:fill="E8E8E8"/>
             <w:shd w:fill="E8E8E8"/>
+            <w:shd w:fill="E8E8E8"/>
           </w:tcPr>
           <w:p>
             <w:pPr>
@@ -3172,6 +3173,7 @@
             <w:vAlign w:val="center"/>
             <w:shd w:fill="E8E8E8"/>
             <w:shd w:fill="E8E8E8"/>
+            <w:shd w:fill="E8E8E8"/>
           </w:tcPr>
           <w:p>
             <w:pPr>
@@ -3198,6 +3200,7 @@
             <w:vAlign w:val="center"/>
             <w:shd w:fill="E8E8E8"/>
             <w:shd w:fill="E8E8E8"/>
+            <w:shd w:fill="E8E8E8"/>
           </w:tcPr>
           <w:p>
             <w:pPr>
@@ -3222,6 +3225,7 @@
             <w:tcW w:w="2100" w:type="dxa"/>
             <w:shd w:val="clear" w:color="auto" w:fill="E8E8E8"/>
             <w:vAlign w:val="center"/>
+            <w:shd w:fill="E8E8E8"/>
             <w:shd w:fill="E8E8E8"/>
             <w:shd w:fill="E8E8E8"/>
           </w:tcPr>
@@ -3915,6 +3919,7 @@
             <w:vAlign w:val="center"/>
             <w:shd w:fill="E8E8E8"/>
             <w:shd w:fill="E8E8E8"/>
+            <w:shd w:fill="E8E8E8"/>
           </w:tcPr>
           <w:p>
             <w:pPr>
@@ -3941,6 +3946,7 @@
             <w:vAlign w:val="center"/>
             <w:shd w:fill="E8E8E8"/>
             <w:shd w:fill="E8E8E8"/>
+            <w:shd w:fill="E8E8E8"/>
           </w:tcPr>
           <w:p>
             <w:pPr>
@@ -3967,6 +3973,7 @@
             <w:vAlign w:val="center"/>
             <w:shd w:fill="E8E8E8"/>
             <w:shd w:fill="E8E8E8"/>
+            <w:shd w:fill="E8E8E8"/>
           </w:tcPr>
           <w:p>
             <w:pPr>
@@ -3993,6 +4000,7 @@
             <w:vAlign w:val="center"/>
             <w:shd w:fill="E8E8E8"/>
             <w:shd w:fill="E8E8E8"/>
+            <w:shd w:fill="E8E8E8"/>
           </w:tcPr>
           <w:p>
             <w:pPr>
@@ -4019,6 +4027,7 @@
             <w:vAlign w:val="center"/>
             <w:shd w:fill="E8E8E8"/>
             <w:shd w:fill="E8E8E8"/>
+            <w:shd w:fill="E8E8E8"/>
           </w:tcPr>
           <w:p>
             <w:pPr>
@@ -4045,6 +4054,7 @@
             <w:vAlign w:val="center"/>
             <w:shd w:fill="E8E8E8"/>
             <w:shd w:fill="E8E8E8"/>
+            <w:shd w:fill="E8E8E8"/>
           </w:tcPr>
           <w:p>
             <w:pPr>
@@ -4071,6 +4081,7 @@
             <w:vAlign w:val="center"/>
             <w:shd w:fill="E8E8E8"/>
             <w:shd w:fill="E8E8E8"/>
+            <w:shd w:fill="E8E8E8"/>
           </w:tcPr>
           <w:p>
             <w:pPr>
@@ -4097,6 +4108,7 @@
             <w:vAlign w:val="center"/>
             <w:shd w:fill="E8E8E8"/>
             <w:shd w:fill="E8E8E8"/>
+            <w:shd w:fill="E8E8E8"/>
           </w:tcPr>
           <w:p>
             <w:pPr>
@@ -4123,6 +4135,7 @@
             <w:vAlign w:val="center"/>
             <w:shd w:fill="E8E8E8"/>
             <w:shd w:fill="E8E8E8"/>
+            <w:shd w:fill="E8E8E8"/>
           </w:tcPr>
           <w:p>
             <w:pPr>
@@ -4149,6 +4162,7 @@
             <w:vAlign w:val="center"/>
             <w:shd w:fill="E8E8E8"/>
             <w:shd w:fill="E8E8E8"/>
+            <w:shd w:fill="E8E8E8"/>
           </w:tcPr>
           <w:p>
             <w:pPr>
@@ -4175,6 +4189,7 @@
             <w:vAlign w:val="center"/>
             <w:shd w:fill="E8E8E8"/>
             <w:shd w:fill="E8E8E8"/>
+            <w:shd w:fill="E8E8E8"/>
           </w:tcPr>
           <w:p>
             <w:pPr>
@@ -4201,6 +4216,7 @@
             <w:vAlign w:val="center"/>
             <w:shd w:fill="E8E8E8"/>
             <w:shd w:fill="E8E8E8"/>
+            <w:shd w:fill="E8E8E8"/>
           </w:tcPr>
           <w:p>
             <w:pPr>
@@ -4227,6 +4243,7 @@
             <w:vAlign w:val="center"/>
             <w:shd w:fill="E8E8E8"/>
             <w:shd w:fill="E8E8E8"/>
+            <w:shd w:fill="E8E8E8"/>
           </w:tcPr>
           <w:p>
             <w:pPr>
@@ -4251,6 +4268,7 @@
             <w:tcW w:w="642" w:type="dxa"/>
             <w:shd w:val="clear" w:color="auto" w:fill="E8E8E8"/>
             <w:vAlign w:val="center"/>
+            <w:shd w:fill="E8E8E8"/>
             <w:shd w:fill="E8E8E8"/>
             <w:shd w:fill="E8E8E8"/>
           </w:tcPr>
@@ -6241,6 +6259,7 @@
             <w:shd w:val="clear" w:color="auto" w:fill="F5F5F5"/>
             <w:shd w:fill="F5F5F5"/>
             <w:shd w:fill="F5F5F5"/>
+            <w:shd w:fill="F5F5F5"/>
           </w:tcPr>
           <w:p>
             <w:pPr>
@@ -6266,6 +6285,7 @@
             <w:shd w:val="clear" w:color="auto" w:fill="F5F5F5"/>
             <w:shd w:fill="F5F5F5"/>
             <w:shd w:fill="F5F5F5"/>
+            <w:shd w:fill="F5F5F5"/>
           </w:tcPr>
           <w:p>
             <w:pPr>
@@ -6291,6 +6311,7 @@
             <w:shd w:val="clear" w:color="auto" w:fill="F5F5F5"/>
             <w:shd w:fill="F5F5F5"/>
             <w:shd w:fill="F5F5F5"/>
+            <w:shd w:fill="F5F5F5"/>
           </w:tcPr>
           <w:p>
             <w:pPr>
@@ -6316,6 +6337,7 @@
             <w:shd w:val="clear" w:color="auto" w:fill="F5F5F5"/>
             <w:shd w:fill="F5F5F5"/>
             <w:shd w:fill="F5F5F5"/>
+            <w:shd w:fill="F5F5F5"/>
           </w:tcPr>
           <w:p>
             <w:pPr>
@@ -6341,6 +6363,7 @@
             <w:shd w:val="clear" w:color="auto" w:fill="F5F5F5"/>
             <w:shd w:fill="F5F5F5"/>
             <w:shd w:fill="F5F5F5"/>
+            <w:shd w:fill="F5F5F5"/>
           </w:tcPr>
           <w:p>
             <w:pPr>
@@ -6366,6 +6389,7 @@
             <w:shd w:val="clear" w:color="auto" w:fill="F5F5F5"/>
             <w:shd w:fill="F5F5F5"/>
             <w:shd w:fill="F5F5F5"/>
+            <w:shd w:fill="F5F5F5"/>
           </w:tcPr>
           <w:p>
             <w:pPr>
@@ -6391,6 +6415,7 @@
             <w:shd w:val="clear" w:color="auto" w:fill="F5F5F5"/>
             <w:shd w:fill="F5F5F5"/>
             <w:shd w:fill="F5F5F5"/>
+            <w:shd w:fill="F5F5F5"/>
           </w:tcPr>
           <w:p>
             <w:pPr>
@@ -6416,6 +6441,7 @@
             <w:shd w:val="clear" w:color="auto" w:fill="F5F5F5"/>
             <w:shd w:fill="F5F5F5"/>
             <w:shd w:fill="F5F5F5"/>
+            <w:shd w:fill="F5F5F5"/>
           </w:tcPr>
           <w:p>
             <w:pPr>
@@ -6441,6 +6467,7 @@
             <w:shd w:val="clear" w:color="auto" w:fill="F5F5F5"/>
             <w:shd w:fill="F5F5F5"/>
             <w:shd w:fill="F5F5F5"/>
+            <w:shd w:fill="F5F5F5"/>
           </w:tcPr>
           <w:p>
             <w:pPr>
@@ -6466,6 +6493,7 @@
             <w:shd w:val="clear" w:color="auto" w:fill="F5F5F5"/>
             <w:shd w:fill="F5F5F5"/>
             <w:shd w:fill="F5F5F5"/>
+            <w:shd w:fill="F5F5F5"/>
           </w:tcPr>
           <w:p>
             <w:pPr>
@@ -6491,6 +6519,7 @@
             <w:shd w:val="clear" w:color="auto" w:fill="F5F5F5"/>
             <w:shd w:fill="F5F5F5"/>
             <w:shd w:fill="F5F5F5"/>
+            <w:shd w:fill="F5F5F5"/>
           </w:tcPr>
           <w:p>
             <w:pPr>
@@ -6516,6 +6545,7 @@
             <w:shd w:val="clear" w:color="auto" w:fill="F5F5F5"/>
             <w:shd w:fill="F5F5F5"/>
             <w:shd w:fill="F5F5F5"/>
+            <w:shd w:fill="F5F5F5"/>
           </w:tcPr>
           <w:p>
             <w:pPr>
@@ -6541,6 +6571,7 @@
             <w:shd w:val="clear" w:color="auto" w:fill="F5F5F5"/>
             <w:shd w:fill="F5F5F5"/>
             <w:shd w:fill="F5F5F5"/>
+            <w:shd w:fill="F5F5F5"/>
           </w:tcPr>
           <w:p>
             <w:pPr>
@@ -6564,6 +6595,7 @@
           <w:tcPr>
             <w:tcW w:w="642" w:type="dxa"/>
             <w:shd w:val="clear" w:color="auto" w:fill="F5F5F5"/>
+            <w:shd w:fill="F5F5F5"/>
             <w:shd w:fill="F5F5F5"/>
             <w:shd w:fill="F5F5F5"/>
           </w:tcPr>
@@ -6662,6 +6694,7 @@
             <w:vAlign w:val="center"/>
             <w:shd w:fill="E8E8E8"/>
             <w:shd w:fill="E8E8E8"/>
+            <w:shd w:fill="E8E8E8"/>
           </w:tcPr>
           <w:p>
             <w:pPr>
@@ -6688,6 +6721,7 @@
             <w:vAlign w:val="center"/>
             <w:shd w:fill="E8E8E8"/>
             <w:shd w:fill="E8E8E8"/>
+            <w:shd w:fill="E8E8E8"/>
           </w:tcPr>
           <w:p>
             <w:pPr>
@@ -6712,6 +6746,7 @@
             <w:tcW w:w="7500" w:type="dxa"/>
             <w:shd w:val="clear" w:color="auto" w:fill="E8E8E8"/>
             <w:vAlign w:val="center"/>
+            <w:shd w:fill="E8E8E8"/>
             <w:shd w:fill="E8E8E8"/>
             <w:shd w:fill="E8E8E8"/>
           </w:tcPr>
@@ -7280,7 +7315,7 @@
                 <w:color w:val="1A1A1A"/>
                 <w:sz w:val="19"/>
               </w:rPr>
-              <w:t>CO → PSO1, PSO2</w:t>
+              <w:t>CO → PSO1</w:t>
             </w:r>
           </w:p>
         </w:tc>
@@ -7302,7 +7337,7 @@
                 <w:color w:val="1A1A1A"/>
                 <w:sz w:val="19"/>
               </w:rPr>
-              <w:t>3 (PSO1, PSO2)</w:t>
+              <w:t>3 (High)</w:t>
             </w:r>
           </w:p>
         </w:tc>
@@ -7324,9 +7359,79 @@
                 <w:color w:val="1A1A1A"/>
                 <w:sz w:val="18"/>
               </w:rPr>
-              <w:t>• PSO1 (3): Demonstrates end-to-end design, training, and deployment of machine learning and computer vision architectures on real-world sensory inputs.</w:t>
+              <w:t>• PSO1 Statement: Apply programming skills and mathematical concepts to design, develop, and optimize AI and machine learning solutions for real-world problems.</w:t>
               <w:br/>
-              <w:t>• PSO2 (3): Implements defense-grade software engineering: asynchronous FastAPI backend, interactive canvas HUD, 33/33 passing unit tests, and production REST APIs.</w:t>
+              <w:t>• Empirical Justification (Level 3): Applied mathematical foundations (pixel moments μ=0.1307, σ=0.3081, center-of-mass translation, convex L-BFGS multinomial logistic regression, RBF SVM Gram matrix complexity control, cross-entropy loss, and post-hoc temperature scaling calibration at T=0.9170 reducing ECE to 0.0031) and software engineering skills (Python 3.13, NumPy array vectorization, OpenCV Otsu binarization, scikit-learn, Keras 3, 35/35 automated unit tests) to design, develop, and optimize DigitVision DeepConvNet (98.31% test accuracy, 0.9831 Macro-F1) solving real-world canvas domain shift and uncalibrated classification in automated cheque/postal processing.</w:t>
+            </w:r>
+          </w:p>
+        </w:tc>
+      </w:tr>
+      <w:tr>
+        <w:tc>
+          <w:tcPr>
+            <w:tcW w:type="dxa" w:w="1600"/>
+          </w:tcPr>
+          <w:p>
+            <w:pPr>
+              <w:spacing w:before="40" w:after="40" w:line="276" w:lineRule="auto"/>
+              <w:jc w:val="left"/>
+            </w:pPr>
+            <w:r/>
+            <w:r>
+              <w:rPr>
+                <w:rFonts w:ascii="Times New Roman" w:hAnsi="Times New Roman"/>
+                <w:b/>
+                <w:i w:val="0"/>
+                <w:color w:val="1A1A1A"/>
+                <w:sz w:val="19"/>
+              </w:rPr>
+              <w:t>CO → PSO2</w:t>
+            </w:r>
+          </w:p>
+        </w:tc>
+        <w:tc>
+          <w:tcPr>
+            <w:tcW w:type="dxa" w:w="900"/>
+          </w:tcPr>
+          <w:p>
+            <w:pPr>
+              <w:spacing w:before="40" w:after="40" w:line="276" w:lineRule="auto"/>
+              <w:jc w:val="center"/>
+            </w:pPr>
+            <w:r/>
+            <w:r>
+              <w:rPr>
+                <w:rFonts w:ascii="Times New Roman" w:hAnsi="Times New Roman"/>
+                <w:b/>
+                <w:i w:val="0"/>
+                <w:color w:val="1A1A1A"/>
+                <w:sz w:val="19"/>
+              </w:rPr>
+              <w:t>3 (High)</w:t>
+            </w:r>
+          </w:p>
+        </w:tc>
+        <w:tc>
+          <w:tcPr>
+            <w:tcW w:type="dxa" w:w="7500"/>
+          </w:tcPr>
+          <w:p>
+            <w:pPr>
+              <w:spacing w:before="40" w:after="40" w:line="276" w:lineRule="auto"/>
+              <w:jc w:val="left"/>
+            </w:pPr>
+            <w:r/>
+            <w:r>
+              <w:rPr>
+                <w:rFonts w:ascii="Times New Roman" w:hAnsi="Times New Roman"/>
+                <w:b w:val="0"/>
+                <w:i w:val="0"/>
+                <w:color w:val="1A1A1A"/>
+                <w:sz w:val="18"/>
+              </w:rPr>
+              <w:t>• PSO2 Statement: Demonstrate competency in Deep Learning, and Data Analytics tools and technologies to build intelligent systems and pursue careers in industry, research, or higher education.</w:t>
+              <w:br/>
+              <w:t>• Empirical Justification (Level 3): Demonstrated technical mastery in Deep Learning (custom dual-block CNN with Batch Normalization, SpatialDropout, Global Average Pooling, and Grad-CAM spatial explainability on conv_cam layer) and Data Analytics tools (70,000-sample EDA, bimodal pixel distributions, 10-cluster unsupervised K-Means geometry discovering 58.87% cluster purity, and calibration reliability analysis across 7 empirical metrics). Delivered a production-grade intelligent system with asynchronous FastAPI backend, sub-10 ms CPU inference, interactive canvas HUD, and telemetry logging, preparing students for AI research and industry engineering roles.</w:t>
             </w:r>
           </w:p>
         </w:tc>
@@ -8814,6 +8919,7 @@
             <w:vAlign w:val="center"/>
             <w:shd w:fill="E8E8E8"/>
             <w:shd w:fill="E8E8E8"/>
+            <w:shd w:fill="E8E8E8"/>
           </w:tcPr>
           <w:p>
             <w:pPr>
@@ -8840,6 +8946,7 @@
             <w:vAlign w:val="center"/>
             <w:shd w:fill="E8E8E8"/>
             <w:shd w:fill="E8E8E8"/>
+            <w:shd w:fill="E8E8E8"/>
           </w:tcPr>
           <w:p>
             <w:pPr>
@@ -8864,6 +8971,7 @@
             <w:tcW w:w="6400" w:type="dxa"/>
             <w:shd w:val="clear" w:color="auto" w:fill="E8E8E8"/>
             <w:vAlign w:val="center"/>
+            <w:shd w:fill="E8E8E8"/>
             <w:shd w:fill="E8E8E8"/>
             <w:shd w:fill="E8E8E8"/>
           </w:tcPr>
@@ -9714,9 +9822,18 @@
     </w:tbl>
     <w:p>
       <w:pPr>
+        <w:pStyle w:val="Heading2"/>
         <w:spacing w:after="60"/>
         <w:jc w:val="both"/>
       </w:pPr>
+      <w:r>
+        <w:rPr>
+          <w:rFonts w:ascii="Times New Roman" w:hAnsi="Times New Roman"/>
+          <w:b/>
+          <w:sz w:val="26"/>
+        </w:rPr>
+        <w:t>Programme Specific Outcomes (PSOs) — Department of CSE (AI &amp; ML)</w:t>
+      </w:r>
     </w:p>
     <w:tbl>
       <w:tblPr>
@@ -9752,20 +9869,21 @@
             <w:tcW w:w="1200" w:type="dxa"/>
             <w:shd w:val="clear" w:color="auto" w:fill="DEEAF6"/>
             <w:vAlign w:val="center"/>
-          </w:tcPr>
-          <w:p>
-            <w:pPr>
-              <w:keepNext/>
-              <w:spacing w:after="40" w:line="264" w:lineRule="auto"/>
-              <w:jc w:val="both"/>
-            </w:pPr>
-            <w:r>
-              <w:rPr>
-                <w:rFonts w:ascii="Times New Roman" w:hAnsi="Times New Roman"/>
-                <w:b/>
-                <w:bCs/>
-                <w:sz w:val="21"/>
-                <w:szCs w:val="21"/>
+            <w:shd w:fill="E8E8E8"/>
+          </w:tcPr>
+          <w:p>
+            <w:pPr>
+              <w:spacing w:before="40" w:after="40" w:line="276" w:lineRule="auto"/>
+              <w:jc w:val="center"/>
+            </w:pPr>
+            <w:r/>
+            <w:r>
+              <w:rPr>
+                <w:rFonts w:ascii="Times New Roman" w:hAnsi="Times New Roman"/>
+                <w:b/>
+                <w:i w:val="0"/>
+                <w:color w:val="1A1A1A"/>
+                <w:sz w:val="20"/>
               </w:rPr>
               <w:t>PSO</w:t>
             </w:r>
@@ -9776,22 +9894,23 @@
             <w:tcW w:w="8800" w:type="dxa"/>
             <w:shd w:val="clear" w:color="auto" w:fill="DEEAF6"/>
             <w:vAlign w:val="center"/>
-          </w:tcPr>
-          <w:p>
-            <w:pPr>
-              <w:keepNext/>
-              <w:spacing w:after="40" w:line="264" w:lineRule="auto"/>
-              <w:jc w:val="both"/>
-            </w:pPr>
-            <w:r>
-              <w:rPr>
-                <w:rFonts w:ascii="Times New Roman" w:hAnsi="Times New Roman"/>
-                <w:b/>
-                <w:bCs/>
-                <w:sz w:val="21"/>
-                <w:szCs w:val="21"/>
-              </w:rPr>
-              <w:t>Programme Specific Outcome (copy from the department’s approved PSOs)</w:t>
+            <w:shd w:fill="E8E8E8"/>
+          </w:tcPr>
+          <w:p>
+            <w:pPr>
+              <w:spacing w:before="40" w:after="40" w:line="276" w:lineRule="auto"/>
+              <w:jc w:val="left"/>
+            </w:pPr>
+            <w:r/>
+            <w:r>
+              <w:rPr>
+                <w:rFonts w:ascii="Times New Roman" w:hAnsi="Times New Roman"/>
+                <w:b/>
+                <w:i w:val="0"/>
+                <w:color w:val="1A1A1A"/>
+                <w:sz w:val="20"/>
+              </w:rPr>
+              <w:t>Approved Department Statement &amp; DigitVision AI Project Alignment</w:t>
             </w:r>
           </w:p>
         </w:tc>
@@ -9809,15 +9928,17 @@
           </w:tcPr>
           <w:p>
             <w:pPr>
-              <w:keepNext/>
-              <w:spacing w:after="40" w:line="264" w:lineRule="auto"/>
-              <w:jc w:val="both"/>
-            </w:pPr>
-            <w:r>
-              <w:rPr>
-                <w:rFonts w:ascii="Times New Roman" w:hAnsi="Times New Roman"/>
-                <w:sz w:val="21"/>
-                <w:szCs w:val="21"/>
+              <w:spacing w:before="40" w:after="40" w:line="276" w:lineRule="auto"/>
+              <w:jc w:val="center"/>
+            </w:pPr>
+            <w:r/>
+            <w:r>
+              <w:rPr>
+                <w:rFonts w:ascii="Times New Roman" w:hAnsi="Times New Roman"/>
+                <w:b/>
+                <w:i w:val="0"/>
+                <w:color w:val="1A1A1A"/>
+                <w:sz w:val="19"/>
               </w:rPr>
               <w:t>PSO1</w:t>
             </w:r>
@@ -9830,10 +9951,29 @@
           </w:tcPr>
           <w:p>
             <w:pPr>
-              <w:keepNext/>
-              <w:spacing w:after="40" w:line="264" w:lineRule="auto"/>
-              <w:jc w:val="both"/>
-            </w:pPr>
+              <w:spacing w:before="40" w:after="40" w:line="276" w:lineRule="auto"/>
+              <w:jc w:val="left"/>
+            </w:pPr>
+            <w:r/>
+            <w:r>
+              <w:rPr>
+                <w:rFonts w:ascii="Times New Roman" w:hAnsi="Times New Roman"/>
+                <w:b w:val="0"/>
+                <w:i w:val="0"/>
+                <w:color w:val="1A1A1A"/>
+                <w:sz w:val="18"/>
+              </w:rPr>
+              <w:t>Apply programming skills and mathematical concepts to design, develop, and optimize AI and machine learning solutions for real-world problems.</w:t>
+              <w:br/>
+              <w:br/>
+              <w:t>• DigitVision AI Empirical Alignment &amp; Implementation Evidence:</w:t>
+              <w:br/>
+              <w:t xml:space="preserve">  1. Mathematical Concepts: Formulated statistical moments (μ=0.1307, σ=0.3081), center-of-mass translation coordinates, convex L2-regularized multinomial logistic regression via L-BFGS, RBF SVM Gram matrix complexity bounding (O(N²) space constraint), categorical cross-entropy loss, and post-hoc temperature scaling calibration (T=0.9170) to optimize Expected Calibration Error (ECE) from 0.0152 down to 0.0031.</w:t>
+              <w:br/>
+              <w:t xml:space="preserve">  2. Programming Skills: Engineered an end-to-end modular pipeline in Python 3.13, utilizing NumPy vectorization, OpenCV image manipulation (Otsu adaptive thresholding, aspect-preserving bounding box scaling), scikit-learn, Keras 3 multi-backend deep learning, and an automated test suite (35/35 passing unit tests).</w:t>
+              <w:br/>
+              <w:t xml:space="preserve">  3. Real-World Optimization: Solved severe domain shift and inverted background discrepancies inherent in user-drawn web canvas sketches, delivering a high-accuracy (98.31%), sub-10 ms CPU inference pipeline for automated postal sortation and banking cheque recognition.</w:t>
+            </w:r>
           </w:p>
         </w:tc>
       </w:tr>
@@ -9850,14 +9990,17 @@
           </w:tcPr>
           <w:p>
             <w:pPr>
-              <w:spacing w:after="40" w:line="264" w:lineRule="auto"/>
-              <w:jc w:val="both"/>
-            </w:pPr>
-            <w:r>
-              <w:rPr>
-                <w:rFonts w:ascii="Times New Roman" w:hAnsi="Times New Roman"/>
-                <w:sz w:val="21"/>
-                <w:szCs w:val="21"/>
+              <w:spacing w:before="40" w:after="40" w:line="276" w:lineRule="auto"/>
+              <w:jc w:val="center"/>
+            </w:pPr>
+            <w:r/>
+            <w:r>
+              <w:rPr>
+                <w:rFonts w:ascii="Times New Roman" w:hAnsi="Times New Roman"/>
+                <w:b/>
+                <w:i w:val="0"/>
+                <w:color w:val="1A1A1A"/>
+                <w:sz w:val="19"/>
               </w:rPr>
               <w:t>PSO2</w:t>
             </w:r>
@@ -9870,9 +10013,29 @@
           </w:tcPr>
           <w:p>
             <w:pPr>
-              <w:spacing w:after="40" w:line="264" w:lineRule="auto"/>
-              <w:jc w:val="both"/>
-            </w:pPr>
+              <w:spacing w:before="40" w:after="40" w:line="276" w:lineRule="auto"/>
+              <w:jc w:val="left"/>
+            </w:pPr>
+            <w:r/>
+            <w:r>
+              <w:rPr>
+                <w:rFonts w:ascii="Times New Roman" w:hAnsi="Times New Roman"/>
+                <w:b w:val="0"/>
+                <w:i w:val="0"/>
+                <w:color w:val="1A1A1A"/>
+                <w:sz w:val="18"/>
+              </w:rPr>
+              <w:t>Demonstrate competency in Deep Learning, and Data Analytics tools and technologies to build intelligent systems and pursue careers in industry, research, or higher education.</w:t>
+              <w:br/>
+              <w:br/>
+              <w:t>• DigitVision AI Empirical Alignment &amp; Implementation Evidence:</w:t>
+              <w:br/>
+              <w:t xml:space="preserve">  1. Deep Learning Competency: Architected and benchmarked DigitVision DeepConvNet featuring dual convolutional blocks (32 and 64 filters), Batch Normalization, SpatialDropout (p=0.25), and Global Average Pooling; benchmarked against historical LeNet-5; implemented Gradient-weighted Class Activation Mapping (Grad-CAM on conv_cam layer) to provide visual spatial explainability of learned biological strokes.</w:t>
+              <w:br/>
+              <w:t xml:space="preserve">  2. Data Analytics Tools &amp; Technologies: Conducted exhaustive Exploratory Data Analysis (EDA) on the 70,000-instance MNIST population, modeled bimodal pixel distributions, performed unsupervised K-Means clustering (K=10, 58.87% purity) to uncover morphological cluster overlap, and evaluated 7 models across 7 performance metrics (Accuracy, Precision, Recall, Macro-F1, Weighted-F1, Latency, Storage).</w:t>
+              <w:br/>
+              <w:t xml:space="preserve">  3. Intelligent Systems &amp; Career Readiness: Built a production-grade, asynchronous FastAPI backend serving live inference, real-time telemetry HUD, and interactive drawing canvas with sub-10 ms latency, cultivating industry-grade engineering practices, reproducible workflows, and research rigor.</w:t>
+            </w:r>
           </w:p>
         </w:tc>
       </w:tr>
@@ -12636,6 +12799,7 @@
             <w:vAlign w:val="center"/>
             <w:shd w:fill="F2F2F2"/>
             <w:shd w:fill="F2F2F2"/>
+            <w:shd w:fill="F2F2F2"/>
           </w:tcPr>
           <w:p>
             <w:pPr>
@@ -12692,6 +12856,7 @@
             <w:vAlign w:val="center"/>
             <w:shd w:fill="F2F2F2"/>
             <w:shd w:fill="F2F2F2"/>
+            <w:shd w:fill="F2F2F2"/>
           </w:tcPr>
           <w:p>
             <w:pPr>
@@ -12747,6 +12912,7 @@
             <w:vAlign w:val="center"/>
             <w:shd w:fill="F2F2F2"/>
             <w:shd w:fill="F2F2F2"/>
+            <w:shd w:fill="F2F2F2"/>
           </w:tcPr>
           <w:p>
             <w:pPr>
@@ -12802,6 +12968,7 @@
             <w:vAlign w:val="center"/>
             <w:shd w:fill="F2F2F2"/>
             <w:shd w:fill="F2F2F2"/>
+            <w:shd w:fill="F2F2F2"/>
           </w:tcPr>
           <w:p>
             <w:pPr>
@@ -12857,6 +13024,7 @@
             <w:vAlign w:val="center"/>
             <w:shd w:fill="F2F2F2"/>
             <w:shd w:fill="F2F2F2"/>
+            <w:shd w:fill="F2F2F2"/>
           </w:tcPr>
           <w:p>
             <w:pPr>
@@ -12912,6 +13080,7 @@
             <w:vAlign w:val="center"/>
             <w:shd w:fill="F2F2F2"/>
             <w:shd w:fill="F2F2F2"/>
+            <w:shd w:fill="F2F2F2"/>
           </w:tcPr>
           <w:p>
             <w:pPr>
@@ -12967,6 +13136,7 @@
             <w:vAlign w:val="center"/>
             <w:shd w:fill="F2F2F2"/>
             <w:shd w:fill="F2F2F2"/>
+            <w:shd w:fill="F2F2F2"/>
           </w:tcPr>
           <w:p>
             <w:pPr>
@@ -13020,6 +13190,7 @@
           <w:tcPr>
             <w:tcW w:w="3800" w:type="dxa"/>
             <w:vAlign w:val="center"/>
+            <w:shd w:fill="F2F2F2"/>
             <w:shd w:fill="F2F2F2"/>
             <w:shd w:fill="F2F2F2"/>
           </w:tcPr>
@@ -13165,6 +13336,7 @@
             <w:vAlign w:val="center"/>
             <w:shd w:fill="F2F2F2"/>
             <w:shd w:fill="F2F2F2"/>
+            <w:shd w:fill="F2F2F2"/>
           </w:tcPr>
           <w:p>
             <w:pPr>
@@ -13221,6 +13393,7 @@
             <w:vAlign w:val="center"/>
             <w:shd w:fill="F2F2F2"/>
             <w:shd w:fill="F2F2F2"/>
+            <w:shd w:fill="F2F2F2"/>
           </w:tcPr>
           <w:p>
             <w:pPr>
@@ -13276,6 +13449,7 @@
             <w:vAlign w:val="center"/>
             <w:shd w:fill="F2F2F2"/>
             <w:shd w:fill="F2F2F2"/>
+            <w:shd w:fill="F2F2F2"/>
           </w:tcPr>
           <w:p>
             <w:pPr>
@@ -13331,6 +13505,7 @@
             <w:vAlign w:val="center"/>
             <w:shd w:fill="F2F2F2"/>
             <w:shd w:fill="F2F2F2"/>
+            <w:shd w:fill="F2F2F2"/>
           </w:tcPr>
           <w:p>
             <w:pPr>
@@ -13386,6 +13561,7 @@
             <w:vAlign w:val="center"/>
             <w:shd w:fill="F2F2F2"/>
             <w:shd w:fill="F2F2F2"/>
+            <w:shd w:fill="F2F2F2"/>
           </w:tcPr>
           <w:p>
             <w:pPr>
@@ -13441,6 +13617,7 @@
             <w:vAlign w:val="center"/>
             <w:shd w:fill="F2F2F2"/>
             <w:shd w:fill="F2F2F2"/>
+            <w:shd w:fill="F2F2F2"/>
           </w:tcPr>
           <w:p>
             <w:pPr>
@@ -13496,6 +13673,7 @@
             <w:vAlign w:val="center"/>
             <w:shd w:fill="F2F2F2"/>
             <w:shd w:fill="F2F2F2"/>
+            <w:shd w:fill="F2F2F2"/>
           </w:tcPr>
           <w:p>
             <w:pPr>
@@ -13551,6 +13729,7 @@
             <w:vAlign w:val="center"/>
             <w:shd w:fill="F2F2F2"/>
             <w:shd w:fill="F2F2F2"/>
+            <w:shd w:fill="F2F2F2"/>
           </w:tcPr>
           <w:p>
             <w:pPr>
@@ -13606,6 +13785,7 @@
             <w:vAlign w:val="center"/>
             <w:shd w:fill="F2F2F2"/>
             <w:shd w:fill="F2F2F2"/>
+            <w:shd w:fill="F2F2F2"/>
           </w:tcPr>
           <w:p>
             <w:pPr>
@@ -13659,6 +13839,7 @@
           <w:tcPr>
             <w:tcW w:w="4400" w:type="dxa"/>
             <w:vAlign w:val="center"/>
+            <w:shd w:fill="F2F2F2"/>
             <w:shd w:fill="F2F2F2"/>
             <w:shd w:fill="F2F2F2"/>
           </w:tcPr>
@@ -17030,6 +17211,7 @@
             <w:vAlign w:val="center"/>
             <w:shd w:fill="E8E8E8"/>
             <w:shd w:fill="E8E8E8"/>
+            <w:shd w:fill="E8E8E8"/>
           </w:tcPr>
           <w:p>
             <w:pPr>
@@ -17056,6 +17238,7 @@
             <w:vAlign w:val="center"/>
             <w:shd w:fill="E8E8E8"/>
             <w:shd w:fill="E8E8E8"/>
+            <w:shd w:fill="E8E8E8"/>
           </w:tcPr>
           <w:p>
             <w:pPr>
@@ -17082,6 +17265,7 @@
             <w:vAlign w:val="center"/>
             <w:shd w:fill="E8E8E8"/>
             <w:shd w:fill="E8E8E8"/>
+            <w:shd w:fill="E8E8E8"/>
           </w:tcPr>
           <w:p>
             <w:pPr>
@@ -17106,6 +17290,7 @@
             <w:tcW w:w="4200" w:type="dxa"/>
             <w:shd w:val="clear" w:color="auto" w:fill="DEEAF6"/>
             <w:vAlign w:val="center"/>
+            <w:shd w:fill="E8E8E8"/>
             <w:shd w:fill="E8E8E8"/>
             <w:shd w:fill="E8E8E8"/>
           </w:tcPr>
@@ -17521,6 +17706,7 @@
             <w:tcW w:type="dxa" w:w="2200"/>
             <w:shd w:fill="F5F5F5"/>
             <w:shd w:fill="F5F5F5"/>
+            <w:shd w:fill="F5F5F5"/>
           </w:tcPr>
           <w:p>
             <w:pPr>
@@ -17545,6 +17731,7 @@
             <w:tcW w:type="dxa" w:w="1500"/>
             <w:shd w:fill="F5F5F5"/>
             <w:shd w:fill="F5F5F5"/>
+            <w:shd w:fill="F5F5F5"/>
           </w:tcPr>
           <w:p>
             <w:pPr>
@@ -17569,6 +17756,7 @@
             <w:tcW w:type="dxa" w:w="2100"/>
             <w:shd w:fill="F5F5F5"/>
             <w:shd w:fill="F5F5F5"/>
+            <w:shd w:fill="F5F5F5"/>
           </w:tcPr>
           <w:p>
             <w:pPr>
@@ -17591,6 +17779,7 @@
         <w:tc>
           <w:tcPr>
             <w:tcW w:type="dxa" w:w="4200"/>
+            <w:shd w:fill="F5F5F5"/>
             <w:shd w:fill="F5F5F5"/>
             <w:shd w:fill="F5F5F5"/>
           </w:tcPr>
@@ -23715,6 +23904,7 @@
             <w:shd w:val="clear" w:color="auto" w:fill="DEEAF6"/>
             <w:vAlign w:val="center"/>
             <w:shd w:fill="E8E8E8"/>
+            <w:shd w:fill="E8E8E8"/>
           </w:tcPr>
           <w:p>
             <w:pPr>
@@ -23740,6 +23930,7 @@
             <w:shd w:val="clear" w:color="auto" w:fill="DEEAF6"/>
             <w:vAlign w:val="center"/>
             <w:shd w:fill="E8E8E8"/>
+            <w:shd w:fill="E8E8E8"/>
           </w:tcPr>
           <w:p>
             <w:pPr>
@@ -23765,6 +23956,7 @@
             <w:shd w:val="clear" w:color="auto" w:fill="DEEAF6"/>
             <w:vAlign w:val="center"/>
             <w:shd w:fill="E8E8E8"/>
+            <w:shd w:fill="E8E8E8"/>
           </w:tcPr>
           <w:p>
             <w:pPr>
@@ -23789,6 +23981,7 @@
             <w:tcW w:w="2400" w:type="dxa"/>
             <w:shd w:val="clear" w:color="auto" w:fill="DEEAF6"/>
             <w:vAlign w:val="center"/>
+            <w:shd w:fill="E8E8E8"/>
             <w:shd w:fill="E8E8E8"/>
           </w:tcPr>
           <w:p>

</xml_diff>